<commit_message>
OHS-32: legal wording tightened after fact-check; quiz Q10/Q12 clarified
Co-Authored-By: Claude Opus 5.5 <noreply@anthropic.com>
Claude-Session: https://claude.ai/code/session_014ssRLpCM1EaDqhp76HRurc
</commit_message>
<xml_diff>
--- a/library/OHS-32 Bullying, Harassment & Discrimination.docx
+++ b/library/OHS-32 Bullying, Harassment & Discrimination.docx
@@ -527,7 +527,7 @@
           <w:rFonts w:cstheme="minorHAnsi"/>
           <w:lang w:val="en-AU"/>
         </w:rPr>
-        <w:t xml:space="preserve"> What counts is how it lands – not what you meant.</w:t>
+        <w:t xml:space="preserve"> Intent doesn’t matter – what counts is that it was unwelcome and could be expected to offend, humiliate or intimidate.</w:t>
       </w:r>
     </w:p>
     <w:p>
@@ -1863,7 +1863,7 @@
           <w:rFonts w:cstheme="minorHAnsi"/>
           <w:lang w:val="en-AU"/>
         </w:rPr>
-        <w:t xml:space="preserve">, in circumstances where a reasonable person would have expected that the person might be </w:t>
+        <w:t xml:space="preserve">, in circumstances where a reasonable person would have anticipated the possibility that the person would be </w:t>
       </w:r>
       <w:r>
         <w:rPr>
@@ -3206,7 +3206,7 @@
           <w:rFonts w:cstheme="minorHAnsi"/>
           <w:lang w:val="en-AU"/>
         </w:rPr>
-        <w:t xml:space="preserve">In Victoria, vilification has been against civil law under the Equal Opportunity Act since 15 April 2026. Inciting hatred, or threatening harm, because of these characteristics are criminal offences.</w:t>
+        <w:t xml:space="preserve">Since 15 April 2026, vilification has been unlawful under Victoria’s Equal Opportunity Act (race and religious vilification were already unlawful under earlier laws). Inciting hatred, or threatening harm, because of these characteristics are criminal offences.</w:t>
       </w:r>
     </w:p>
     <w:p>
@@ -4022,7 +4022,7 @@
           <w:rFonts w:cstheme="minorHAnsi"/>
           <w:lang w:val="en-AU"/>
         </w:rPr>
-        <w:t xml:space="preserve"> That is a crime.</w:t>
+        <w:t xml:space="preserve"> Doing it without consent is a crime.</w:t>
       </w:r>
     </w:p>
     <w:p>
@@ -6653,7 +6653,7 @@
                 <w:rFonts w:cstheme="minorHAnsi"/>
                 <w:lang w:val="en-AU"/>
               </w:rPr>
-              <w:t xml:space="preserve"> We will never ask or pressure anyone to sign a confidentiality agreement (NDA) about workplace sexual harassment. Under Victorian law, since 1 July 2026 an NDA in a workplace sexual harassment matter can only be made if the person who was harassed asks for one.</w:t>
+              <w:t xml:space="preserve"> We will never ask or pressure anyone to sign a confidentiality agreement (NDA) about workplace sexual harassment. Under Victorian law, since 1 July 2026 an NDA in a workplace sexual harassment matter is only enforceable if the person who was harassed asked for it and the legal safeguards are met – including a government information statement and at least 21 days to consider it. They can always still speak to police, lawyers, doctors, unions and regulators.</w:t>
             </w:r>
           </w:p>
         </w:tc>
@@ -6787,7 +6787,7 @@
           <w:rFonts w:cstheme="minorHAnsi"/>
           <w:lang w:val="en-AU"/>
         </w:rPr>
-        <w:t xml:space="preserve"> Only complaints made knowing they are untrue, or made to cause harm, are false – and those are misconduct.</w:t>
+        <w:t xml:space="preserve"> Only complaints made knowing they are untrue, or otherwise in bad faith, are misconduct.</w:t>
       </w:r>
     </w:p>
     <w:p>
@@ -7336,7 +7336,7 @@
                 <w:rFonts w:cstheme="minorHAnsi"/>
                 <w:lang w:val="en-AU"/>
               </w:rPr>
-              <w:t xml:space="preserve">LGBTIQ+ peer support</w:t>
+              <w:t xml:space="preserve">LGBTIQ+ peer support – afternoons and evenings</w:t>
             </w:r>
           </w:p>
         </w:tc>
@@ -7532,7 +7532,7 @@
           <w:rFonts w:cstheme="minorHAnsi"/>
           <w:lang w:val="en-AU"/>
         </w:rPr>
-        <w:t xml:space="preserve"> bullying, harassment and discrimination – not just respond once it happens. This is what we do, set out against the seven standards the Australian Human Rights Commission uses to judge whether an organisation is meeting that duty:</w:t>
+        <w:t xml:space="preserve"> bullying, harassment and discrimination – not just respond once it happens. This is what we do, set out against the seven standards the Australian Human Rights Commission uses for the federal positive duty on sexual harassment and sex discrimination. We apply them to all of the behaviours in this module:</w:t>
       </w:r>
     </w:p>
     <w:tbl>
@@ -9244,7 +9244,7 @@
                 <w:rFonts w:cstheme="minorHAnsi"/>
                 <w:lang w:val="en-AU"/>
               </w:rPr>
-              <w:t xml:space="preserve">Employers must provide a workplace that is safe and without risks to health – including mental health. Every worker must take reasonable care of their own and others’ health and safety, and cooperate with safety measures.</w:t>
+              <w:t xml:space="preserve">Employers must, so far as is reasonably practicable, provide a workplace that is safe and without risks to health – including mental health. Every worker must take reasonable care of their own and others’ health and safety, and cooperate with safety measures.</w:t>
             </w:r>
           </w:p>
         </w:tc>
@@ -9548,7 +9548,7 @@
                 <w:rFonts w:cstheme="minorHAnsi"/>
                 <w:lang w:val="en-AU"/>
               </w:rPr>
-              <w:t xml:space="preserve">Since 1 July 2026, NDAs about workplace sexual harassment can only be made if the person harassed asks for one.</w:t>
+              <w:t xml:space="preserve">Since 1 July 2026, an NDA about workplace sexual harassment is only enforceable if the person harassed asked for it and the safeguards are met (information statement, 21 days to consider it).</w:t>
             </w:r>
           </w:p>
         </w:tc>

</xml_diff>